<commit_message>
docs: finish the full doc build — HTML, help, PDF, DOCX, website (en+fr)
Installed pandoc and fixed three build.py blockers so the whole
documentation pipeline runs end to end:
  - docx delegation crashed on Windows cp1252 ('→') — child now forced
    to UTF-8 (PYTHONUTF8).
  - website build invoked bare `npm`, unresolvable by subprocess on
    Windows — now resolves npm.cmd via shutil.which.
  - (earlier) the pandoc-fallback HTML path passed unsupported flags.

Regenerated USER_MANUAL.pdf (1.9 MB) / USER_MANUAL_fr.pdf (2.1 MB) and
the .docx, all from the GitHub-scrubbed sources. HTML, the SPA help
fragments, and the Astro website (en+fr) rebuild cleanly too.

Co-Authored-By: Claude Opus 4.7 (1M context) <noreply@anthropic.com>
</commit_message>
<xml_diff>
--- a/docs/USER_MANUAL.docx
+++ b/docs/USER_MANUAL.docx
@@ -14274,7 +14274,7 @@
     </w:p>
     <w:p>
       <w:r>
-        <w:t xml:space="preserve">binary (a download mid-update or a hand-edited registry), the orchestrator falls back to the GitHub release for that board's </w:t>
+        <w:t xml:space="preserve">binary (a download mid-update or a hand-edited registry), the orchestrator falls back to the published firmware release for that board's </w:t>
       </w:r>
       <w:r>
         <w:rPr>
@@ -14393,7 +14393,7 @@
         <w:t>releaseAsset</w:t>
       </w:r>
       <w:r>
-        <w:t xml:space="preserve"> — the GitHub release tag and the</w:t>
+        <w:t xml:space="preserve"> — the published firmware release tag and the</w:t>
       </w:r>
     </w:p>
     <w:p>
@@ -14441,7 +14441,7 @@
         <w:t>build_release.ps1</w:t>
       </w:r>
       <w:r>
-        <w:t xml:space="preserve"> keeps it in sync with the actual binary hashes on every release. The Firmware tab refreshes the registry from GitHub on demand from the </w:t>
+        <w:t xml:space="preserve"> keeps it in sync with the actual binary hashes on every release. The Firmware tab refreshes the registry from the release server on demand from the </w:t>
       </w:r>
       <w:r>
         <w:rPr>
@@ -15635,7 +15635,7 @@
           <w:p>
             <w:r/>
             <w:r>
-              <w:t xml:space="preserve">Fixed in v1.7.61 (#814). The orchestrator now falls back to the GitHub release for the registered </w:t>
+              <w:t xml:space="preserve">Fixed in v1.7.61 (#814). The orchestrator now falls back to the published firmware release for the registered </w:t>
             </w:r>
             <w:r>
               <w:rPr>
@@ -15662,7 +15662,7 @@
               <w:t>registry.json</w:t>
             </w:r>
             <w:r>
-              <w:t xml:space="preserve"> from GitHub.</w:t>
+              <w:t xml:space="preserve"> from the release server.</w:t>
             </w:r>
           </w:p>
         </w:tc>
@@ -15708,7 +15708,7 @@
     </w:tbl>
     <w:p>
       <w:r>
-        <w:t>If you hit something not in this table, the orchestrator's log (Settings → Logging → enable file logging) captures every UDP send and DMX render decision tagged by issue number — open an issue on GitHub with the relevant section attached and a description of what the rig was doing at the moment.</w:t>
+        <w:t>If you hit something not in this table, the orchestrator's log (Settings → Logging → enable file logging) captures every UDP send and DMX render decision tagged by issue number — report it through your support channel with the relevant section attached and a description of what the rig was doing at the moment.</w:t>
       </w:r>
     </w:p>
     <w:p>
@@ -25135,7 +25135,7 @@
           <w:p>
             <w:r/>
             <w:r>
-              <w:t>Git/GitHub workflow — a proposed change on a branch, reviewed before merge.</w:t>
+              <w:t>version-control workflow — a proposed change on a branch, reviewed before merge.</w:t>
             </w:r>
           </w:p>
         </w:tc>
@@ -27070,96 +27070,70 @@
         <w:rPr>
           <w:i/>
         </w:rPr>
-        <w:t xml:space="preserve"> If a term appears in the manual but isn't in this table, that's a bug in the glossary — open an issue or PR against </w:t>
-      </w:r>
-      <w:r>
-        <w:rPr>
-          <w:color w:val="1E4FC1"/>
-          <w:u w:val="single"/>
-        </w:rPr>
-        <w:t>#663</w:t>
-      </w:r>
+        <w:t xml:space="preserve"> If a term appears in the manual but isn't in this table, that's a gap in the glossary — let the SlyLED team know so it can be added.</w:t>
+      </w:r>
+    </w:p>
+    <w:p>
+      <w:pPr>
+        <w:jc w:val="center"/>
+      </w:pPr>
+      <w:r>
+        <w:t>────────────────────────────────────────</w:t>
+      </w:r>
+    </w:p>
+    <w:p>
+      <w:pPr>
+        <w:pStyle w:val="Heading2"/>
+      </w:pPr>
+      <w:r>
+        <w:t>Appendix A — Camera Calibration Pipeline (DRAFT)</w:t>
+      </w:r>
+    </w:p>
+    <w:p>
+      <w:pPr>
+        <w:ind w:left="432"/>
+      </w:pPr>
       <w:r>
         <w:rPr>
           <w:i/>
         </w:rPr>
-        <w:t>.</w:t>
-      </w:r>
-    </w:p>
-    <w:p>
-      <w:pPr>
-        <w:jc w:val="center"/>
-      </w:pPr>
-      <w:r>
-        <w:t>────────────────────────────────────────</w:t>
-      </w:r>
-    </w:p>
-    <w:p>
-      <w:pPr>
-        <w:pStyle w:val="Heading2"/>
-      </w:pPr>
-      <w:r>
-        <w:t>Appendix A — Camera Calibration Pipeline (DRAFT)</w:t>
-      </w:r>
-    </w:p>
-    <w:p>
-      <w:pPr>
-        <w:ind w:left="432"/>
-      </w:pPr>
+        <w:t xml:space="preserve">⚠ </w:t>
+      </w:r>
+      <w:r>
+        <w:rPr>
+          <w:b/>
+        </w:rPr>
+        <w:t>DRAFT — assumes all in-flight work is merged.</w:t>
+      </w:r>
       <w:r>
         <w:rPr>
           <w:i/>
         </w:rPr>
-        <w:t xml:space="preserve">⚠ </w:t>
+        <w:t xml:space="preserve"> This appendix describes the camera-calibration pipeline under the assumption that issues #610, #651–#661, and #357 are fully implemented. Some features documented below are </w:t>
       </w:r>
       <w:r>
         <w:rPr>
           <w:b/>
         </w:rPr>
-        <w:t>DRAFT — assumes all in-flight work is merged.</w:t>
+        <w:t>partially merged</w:t>
       </w:r>
       <w:r>
         <w:rPr>
           <w:i/>
         </w:rPr>
-        <w:t xml:space="preserve"> This appendix describes the camera-calibration pipeline under the assumption that issues #610, #651–#661, and #357 are fully implemented. Some features documented below are </w:t>
-      </w:r>
-      <w:r>
-        <w:rPr>
-          <w:b/>
-        </w:rPr>
-        <w:t>partially merged</w:t>
+        <w:t xml:space="preserve"> today (notably full intrinsic calibration of every camera, dark-reference integration into the mover pipeline per #651, and the floor-view polygon target filter per #659). See </w:t>
+      </w:r>
+      <w:r>
+        <w:rPr>
+          <w:rFonts w:ascii="Consolas" w:hAnsi="Consolas"/>
+        </w:rPr>
+        <w:t>docs/DOCS_MAINTENANCE.md</w:t>
       </w:r>
       <w:r>
         <w:rPr>
           <w:i/>
         </w:rPr>
-        <w:t xml:space="preserve"> today (notably full intrinsic calibration of every camera, dark-reference integration into the mover pipeline per #651, and the floor-view polygon target filter per #659). See </w:t>
-      </w:r>
-      <w:r>
-        <w:rPr>
-          <w:rFonts w:ascii="Consolas" w:hAnsi="Consolas"/>
-        </w:rPr>
-        <w:t>docs/DOCS_MAINTENANCE.md</w:t>
-      </w:r>
-      <w:r>
-        <w:rPr>
-          <w:i/>
-        </w:rPr>
-        <w:t xml:space="preserve"> for the current merge status and the criteria for removing this banner. Issue </w:t>
-      </w:r>
-      <w:r>
-        <w:rPr>
-          <w:color w:val="1E4FC1"/>
-          <w:u w:val="single"/>
-        </w:rPr>
-        <w:t>#662</w:t>
-      </w:r>
-      <w:r>
-        <w:rPr>
-          <w:i/>
-        </w:rPr>
-        <w:t>.</w:t>
+        <w:t xml:space="preserve"> for the current merge status and the criteria for removing this banner. Issue #662.</w:t>
       </w:r>
     </w:p>
     <w:p>
@@ -35998,20 +35972,7 @@
         <w:rPr>
           <w:i/>
         </w:rPr>
-        <w:t xml:space="preserve">This appendix describes the contract between the calibration appendices above and the source code that implements them. It exists for issue </w:t>
-      </w:r>
-      <w:r>
-        <w:rPr>
-          <w:color w:val="1E4FC1"/>
-          <w:u w:val="single"/>
-        </w:rPr>
-        <w:t>#662</w:t>
-      </w:r>
-      <w:r>
-        <w:rPr>
-          <w:i/>
-        </w:rPr>
-        <w:t xml:space="preserve"> and is kept short — full details are in </w:t>
+        <w:t xml:space="preserve">This appendix describes the contract between the calibration appendices above and the source code that implements them. It exists for issue #662 and is kept short — full details are in </w:t>
       </w:r>
       <w:r>
         <w:rPr>
@@ -36411,7 +36372,7 @@
         <w:t>docs/diagrams/*.mmd</w:t>
       </w:r>
       <w:r>
-        <w:t>. Mermaid blocks are embedded inline in the markdown so GitHub renders them directly; external renderers like Kroki can generate SVG/PNG from the standalone files for PDF inclusion.</w:t>
+        <w:t>. Mermaid blocks are embedded inline in the markdown so Markdown viewers render them directly; external renderers like Kroki can generate SVG/PNG from the standalone files for PDF inclusion.</w:t>
       </w:r>
     </w:p>
     <w:p>
@@ -36433,16 +36394,7 @@
         <w:ind w:left="360"/>
       </w:pPr>
       <w:r>
-        <w:t>PR-template checkbox (</w:t>
-      </w:r>
-      <w:r>
-        <w:rPr>
-          <w:rFonts w:ascii="Consolas" w:hAnsi="Consolas"/>
-        </w:rPr>
-        <w:t>.github/pull_request_template.md</w:t>
-      </w:r>
-      <w:r>
-        <w:t>)</w:t>
+        <w:t>PR-template checkbox in the pull-request template</w:t>
       </w:r>
     </w:p>
     <w:p>
@@ -36451,7 +36403,7 @@
         <w:ind w:left="360"/>
       </w:pPr>
       <w:r>
-        <w:t xml:space="preserve">GitHub Actions grep: fail PRs that touch the source-of-truth list without touching </w:t>
+        <w:t xml:space="preserve">A CI grep: fail PRs that touch the source-of-truth list without touching </w:t>
       </w:r>
       <w:r>
         <w:rPr>
@@ -36474,16 +36426,7 @@
     </w:p>
     <w:p>
       <w:r>
-        <w:t xml:space="preserve">These require </w:t>
-      </w:r>
-      <w:r>
-        <w:rPr>
-          <w:rFonts w:ascii="Consolas" w:hAnsi="Consolas"/>
-        </w:rPr>
-        <w:t>.github/</w:t>
-      </w:r>
-      <w:r>
-        <w:t xml:space="preserve"> changes and are tracked as follow-ups under #662.</w:t>
+        <w:t>These require CI-configuration changes and are tracked as follow-ups under #662.</w:t>
       </w:r>
     </w:p>
     <w:p>

</xml_diff>

<commit_message>
docs: rebuild manuals/PDF/website with reconciled screenshot paths
Co-Authored-By: Claude Opus 4.7 (1M context) <noreply@anthropic.com>
</commit_message>
<xml_diff>
--- a/docs/USER_MANUAL.docx
+++ b/docs/USER_MANUAL.docx
@@ -1822,12 +1822,12 @@
     </w:p>
     <w:p>
       <w:r>
-        <w:t>[Image: screenshots/walkthrough-533/06-cam1_left_hires.png — not found]</w:t>
-      </w:r>
-    </w:p>
-    <w:p>
-      <w:r>
-        <w:t>[Image: screenshots/walkthrough-533/06-cam2_right.png — not found]</w:t>
+        <w:t>[Image: screenshots/walkthrough/06-cam1_left_hires.png — not found]</w:t>
+      </w:r>
+    </w:p>
+    <w:p>
+      <w:r>
+        <w:t>[Image: screenshots/walkthrough/06-cam2_right.png — not found]</w:t>
       </w:r>
     </w:p>
     <w:p>
@@ -2288,12 +2288,12 @@
     </w:p>
     <w:p>
       <w:r>
-        <w:t>[Image: screenshots/walkthrough-533/04d-layout-positions.png — not found]</w:t>
-      </w:r>
-    </w:p>
-    <w:p>
-      <w:r>
-        <w:t>[Image: screenshots/walkthrough-533/06c-cameras-positioned.png — not found]</w:t>
+        <w:t>[Image: screenshots/walkthrough/04d-layout-positions.png — not found]</w:t>
+      </w:r>
+    </w:p>
+    <w:p>
+      <w:r>
+        <w:t>[Image: screenshots/walkthrough/06c-cameras-positioned.png — not found]</w:t>
       </w:r>
     </w:p>
     <w:p>
@@ -2581,7 +2581,7 @@
     </w:p>
     <w:p>
       <w:r>
-        <w:t>[Image: screenshots/walkthrough-533/07-calibrate-ui.png — not found]</w:t>
+        <w:t>[Image: screenshots/walkthrough/07-calibrate-ui.png — not found]</w:t>
       </w:r>
     </w:p>
     <w:p>

</xml_diff>